<commit_message>
Agregar capturas de consola al reporte del taller
Reemplaza los bloques de texto de la sección 5 por imágenes de la
ejecución real del programa y actualiza el zip de entrega.

Co-Authored-By: Claude Opus 5.5 <noreply@anthropic.com>
Claude-Session: https://claude.ai/code/session_01NqmvCN2Estp1WsorWWYm43
</commit_message>
<xml_diff>
--- a/entrega_taller/Reporte_taller_teoria_editable.docx
+++ b/entrega_taller/Reporte_taller_teoria_editable.docx
@@ -2473,7 +2473,7 @@
           <w:b w:val="0"/>
           <w:i w:val="0"/>
         </w:rPr>
-        <w:t>Se compiló el programa y se ejecutó en consola pasando como argumentos el archivo de datos y el rango de fechas solicitado (Java 17 o superior):</w:t>
+        <w:t>Se compiló el programa y se ejecutó en consola pasando como argumentos el archivo de datos y el rango de fechas solicitado (Java 17 o superior).</w:t>
       </w:r>
     </w:p>
     <w:p>
@@ -2486,47 +2486,68 @@
           <w:b/>
           <w:i w:val="0"/>
         </w:rPr>
-        <w:t>Comando de compilación:</w:t>
+        <w:t>Compilación:</w:t>
       </w:r>
     </w:p>
-    <w:tbl>
-      <w:tblPr>
-        <w:tblStyle w:val="TableGrid"/>
-        <w:tblW w:type="auto" w:w="0"/>
-        <w:jc w:val="center"/>
-        <w:tblLook w:firstColumn="1" w:firstRow="1" w:lastColumn="0" w:lastRow="0" w:noHBand="0" w:noVBand="1" w:val="04A0"/>
-      </w:tblPr>
-      <w:tblGrid>
-        <w:gridCol w:w="9360"/>
-      </w:tblGrid>
-      <w:tr>
-        <w:trPr>
-          <w:cantSplit/>
-        </w:trPr>
-        <w:tc>
-          <w:tcPr>
-            <w:tcW w:type="dxa" w:w="9360"/>
-            <w:shd w:val="clear" w:color="auto" w:fill="F2F2F2"/>
-          </w:tcPr>
-          <w:p>
-            <w:pPr>
-              <w:spacing w:after="0" w:line="240" w:lineRule="auto"/>
-            </w:pPr>
-            <w:r>
-              <w:rPr>
-                <w:rFonts w:ascii="Courier New" w:hAnsi="Courier New"/>
-                <w:sz w:val="20"/>
-              </w:rPr>
-              <w:t>javac Main.java</w:t>
-            </w:r>
-          </w:p>
-        </w:tc>
-      </w:tr>
-    </w:tbl>
     <w:p>
       <w:pPr>
+        <w:keepNext/>
         <w:spacing w:after="40"/>
+        <w:jc w:val="center"/>
       </w:pPr>
+      <w:r>
+        <w:drawing>
+          <wp:inline xmlns:a="http://schemas.openxmlformats.org/drawingml/2006/main" xmlns:pic="http://schemas.openxmlformats.org/drawingml/2006/picture">
+            <wp:extent cx="5220000" cy="1240846"/>
+            <wp:docPr id="1" name="Picture 1"/>
+            <wp:cNvGraphicFramePr>
+              <a:graphicFrameLocks noChangeAspect="1"/>
+            </wp:cNvGraphicFramePr>
+            <a:graphic>
+              <a:graphicData uri="http://schemas.openxmlformats.org/drawingml/2006/picture">
+                <pic:pic>
+                  <pic:nvPicPr>
+                    <pic:cNvPr id="0" name="consola1.png"/>
+                    <pic:cNvPicPr/>
+                  </pic:nvPicPr>
+                  <pic:blipFill>
+                    <a:blip r:embed="rId10"/>
+                    <a:stretch>
+                      <a:fillRect/>
+                    </a:stretch>
+                  </pic:blipFill>
+                  <pic:spPr>
+                    <a:xfrm>
+                      <a:off x="0" y="0"/>
+                      <a:ext cx="5220000" cy="1240846"/>
+                    </a:xfrm>
+                    <a:prstGeom prst="rect"/>
+                  </pic:spPr>
+                </pic:pic>
+              </a:graphicData>
+            </a:graphic>
+          </wp:inline>
+        </w:drawing>
+      </w:r>
+    </w:p>
+    <w:p>
+      <w:pPr>
+        <w:jc w:val="center"/>
+      </w:pPr>
+      <w:r>
+        <w:rPr>
+          <w:b/>
+          <w:sz w:val="20"/>
+        </w:rPr>
+        <w:t xml:space="preserve">Figura 1. </w:t>
+      </w:r>
+      <w:r>
+        <w:rPr>
+          <w:i/>
+          <w:sz w:val="20"/>
+        </w:rPr>
+        <w:t>Compilación con javac Main.java: no se reportan errores y se generan las clases.</w:t>
+      </w:r>
     </w:p>
     <w:p>
       <w:pPr>
@@ -2538,335 +2559,68 @@
           <w:b/>
           <w:i w:val="0"/>
         </w:rPr>
-        <w:t>Comando de ejecución:</w:t>
+        <w:t>Ejecución con el periodo 2026-01-01 a 2026-06-30:</w:t>
       </w:r>
-    </w:p>
-    <w:tbl>
-      <w:tblPr>
-        <w:tblStyle w:val="TableGrid"/>
-        <w:tblW w:type="auto" w:w="0"/>
-        <w:jc w:val="center"/>
-        <w:tblLook w:firstColumn="1" w:firstRow="1" w:lastColumn="0" w:lastRow="0" w:noHBand="0" w:noVBand="1" w:val="04A0"/>
-      </w:tblPr>
-      <w:tblGrid>
-        <w:gridCol w:w="9360"/>
-      </w:tblGrid>
-      <w:tr>
-        <w:trPr>
-          <w:cantSplit/>
-        </w:trPr>
-        <w:tc>
-          <w:tcPr>
-            <w:tcW w:type="dxa" w:w="9360"/>
-            <w:shd w:val="clear" w:color="auto" w:fill="F2F2F2"/>
-          </w:tcPr>
-          <w:p>
-            <w:pPr>
-              <w:spacing w:after="0" w:line="240" w:lineRule="auto"/>
-            </w:pPr>
-            <w:r>
-              <w:rPr>
-                <w:rFonts w:ascii="Courier New" w:hAnsi="Courier New"/>
-                <w:sz w:val="20"/>
-              </w:rPr>
-              <w:t>java Main ventas.csv 2026-01-01 2026-06-30</w:t>
-            </w:r>
-          </w:p>
-        </w:tc>
-      </w:tr>
-    </w:tbl>
-    <w:p>
-      <w:pPr>
-        <w:spacing w:after="40"/>
-      </w:pPr>
     </w:p>
     <w:p>
       <w:pPr>
         <w:keepNext/>
         <w:spacing w:after="40"/>
+        <w:jc w:val="center"/>
+      </w:pPr>
+      <w:r>
+        <w:drawing>
+          <wp:inline xmlns:a="http://schemas.openxmlformats.org/drawingml/2006/main" xmlns:pic="http://schemas.openxmlformats.org/drawingml/2006/picture">
+            <wp:extent cx="5220000" cy="4326721"/>
+            <wp:docPr id="2" name="Picture 2"/>
+            <wp:cNvGraphicFramePr>
+              <a:graphicFrameLocks noChangeAspect="1"/>
+            </wp:cNvGraphicFramePr>
+            <a:graphic>
+              <a:graphicData uri="http://schemas.openxmlformats.org/drawingml/2006/picture">
+                <pic:pic>
+                  <pic:nvPicPr>
+                    <pic:cNvPr id="0" name="consola2.png"/>
+                    <pic:cNvPicPr/>
+                  </pic:nvPicPr>
+                  <pic:blipFill>
+                    <a:blip r:embed="rId11"/>
+                    <a:stretch>
+                      <a:fillRect/>
+                    </a:stretch>
+                  </pic:blipFill>
+                  <pic:spPr>
+                    <a:xfrm>
+                      <a:off x="0" y="0"/>
+                      <a:ext cx="5220000" cy="4326721"/>
+                    </a:xfrm>
+                    <a:prstGeom prst="rect"/>
+                  </pic:spPr>
+                </pic:pic>
+              </a:graphicData>
+            </a:graphic>
+          </wp:inline>
+        </w:drawing>
+      </w:r>
+    </w:p>
+    <w:p>
+      <w:pPr>
+        <w:jc w:val="center"/>
       </w:pPr>
       <w:r>
         <w:rPr>
           <w:b/>
-          <w:i w:val="0"/>
+          <w:sz w:val="20"/>
         </w:rPr>
-        <w:t>Salida de consola:</w:t>
+        <w:t xml:space="preserve">Figura 2. </w:t>
       </w:r>
-    </w:p>
-    <w:tbl>
-      <w:tblPr>
-        <w:tblStyle w:val="TableGrid"/>
-        <w:tblW w:type="auto" w:w="0"/>
-        <w:jc w:val="center"/>
-        <w:tblLook w:firstColumn="1" w:firstRow="1" w:lastColumn="0" w:lastRow="0" w:noHBand="0" w:noVBand="1" w:val="04A0"/>
-      </w:tblPr>
-      <w:tblGrid>
-        <w:gridCol w:w="9360"/>
-      </w:tblGrid>
-      <w:tr>
-        <w:trPr>
-          <w:cantSplit/>
-        </w:trPr>
-        <w:tc>
-          <w:tcPr>
-            <w:tcW w:type="dxa" w:w="9360"/>
-            <w:shd w:val="clear" w:color="auto" w:fill="F2F2F2"/>
-          </w:tcPr>
-          <w:p>
-            <w:pPr>
-              <w:spacing w:after="0" w:line="240" w:lineRule="auto"/>
-            </w:pPr>
-            <w:r>
-              <w:rPr>
-                <w:rFonts w:ascii="Courier New" w:hAnsi="Courier New"/>
-                <w:sz w:val="18"/>
-              </w:rPr>
-              <w:t>=================================================</w:t>
-              <w:br/>
-            </w:r>
-            <w:r>
-              <w:rPr>
-                <w:rFonts w:ascii="Courier New" w:hAnsi="Courier New"/>
-                <w:sz w:val="18"/>
-              </w:rPr>
-              <w:t xml:space="preserve">           REPORTE DE VENTAS</w:t>
-              <w:br/>
-            </w:r>
-            <w:r>
-              <w:rPr>
-                <w:rFonts w:ascii="Courier New" w:hAnsi="Courier New"/>
-                <w:sz w:val="18"/>
-              </w:rPr>
-              <w:t>Periodo: 2026-01-01 a 2026-06-30</w:t>
-              <w:br/>
-            </w:r>
-            <w:r>
-              <w:rPr>
-                <w:rFonts w:ascii="Courier New" w:hAnsi="Courier New"/>
-                <w:sz w:val="18"/>
-              </w:rPr>
-              <w:t>=================================================</w:t>
-              <w:br/>
-            </w:r>
-            <w:r>
-              <w:rPr>
-                <w:rFonts w:ascii="Courier New" w:hAnsi="Courier New"/>
-                <w:sz w:val="18"/>
-              </w:rPr>
-              <w:t>Totales del periodo: Ventas Registradas -&gt; 13     Dinero Recaudado-&gt; $14.210.000</w:t>
-              <w:br/>
-            </w:r>
-            <w:r>
-              <w:rPr>
-                <w:rFonts w:ascii="Courier New" w:hAnsi="Courier New"/>
-                <w:sz w:val="18"/>
-              </w:rPr>
-              <w:br/>
-            </w:r>
-            <w:r>
-              <w:rPr>
-                <w:rFonts w:ascii="Courier New" w:hAnsi="Courier New"/>
-                <w:sz w:val="18"/>
-              </w:rPr>
-              <w:t>--- CLIENTES QUE MAS COMPRARON (por cantidad de ventas) ---</w:t>
-              <w:br/>
-            </w:r>
-            <w:r>
-              <w:rPr>
-                <w:rFonts w:ascii="Courier New" w:hAnsi="Courier New"/>
-                <w:sz w:val="18"/>
-              </w:rPr>
-              <w:t>#    Cliente                     Cantidad  Dinero gastado</w:t>
-              <w:br/>
-            </w:r>
-            <w:r>
-              <w:rPr>
-                <w:rFonts w:ascii="Courier New" w:hAnsi="Courier New"/>
-                <w:sz w:val="18"/>
-              </w:rPr>
-              <w:t>1    Ana Torres                         4       5.780.000</w:t>
-              <w:br/>
-            </w:r>
-            <w:r>
-              <w:rPr>
-                <w:rFonts w:ascii="Courier New" w:hAnsi="Courier New"/>
-                <w:sz w:val="18"/>
-              </w:rPr>
-              <w:t>2    María Gómez                        4       1.870.000</w:t>
-              <w:br/>
-            </w:r>
-            <w:r>
-              <w:rPr>
-                <w:rFonts w:ascii="Courier New" w:hAnsi="Courier New"/>
-                <w:sz w:val="18"/>
-              </w:rPr>
-              <w:t>3    Carlos Ruiz                        3       5.360.000</w:t>
-              <w:br/>
-            </w:r>
-            <w:r>
-              <w:rPr>
-                <w:rFonts w:ascii="Courier New" w:hAnsi="Courier New"/>
-                <w:sz w:val="18"/>
-              </w:rPr>
-              <w:t>4    Luis Pérez                         2       1.200.000</w:t>
-              <w:br/>
-            </w:r>
-            <w:r>
-              <w:rPr>
-                <w:rFonts w:ascii="Courier New" w:hAnsi="Courier New"/>
-                <w:sz w:val="18"/>
-              </w:rPr>
-              <w:br/>
-            </w:r>
-            <w:r>
-              <w:rPr>
-                <w:rFonts w:ascii="Courier New" w:hAnsi="Courier New"/>
-                <w:sz w:val="18"/>
-              </w:rPr>
-              <w:t>--- CLIENTES QUE MAS COMPRARON (por dinero) ---</w:t>
-              <w:br/>
-            </w:r>
-            <w:r>
-              <w:rPr>
-                <w:rFonts w:ascii="Courier New" w:hAnsi="Courier New"/>
-                <w:sz w:val="18"/>
-              </w:rPr>
-              <w:t>#    Cliente                    Dinero gastado</w:t>
-              <w:br/>
-            </w:r>
-            <w:r>
-              <w:rPr>
-                <w:rFonts w:ascii="Courier New" w:hAnsi="Courier New"/>
-                <w:sz w:val="18"/>
-              </w:rPr>
-              <w:t>1    Ana Torres                      5.780.000</w:t>
-              <w:br/>
-            </w:r>
-            <w:r>
-              <w:rPr>
-                <w:rFonts w:ascii="Courier New" w:hAnsi="Courier New"/>
-                <w:sz w:val="18"/>
-              </w:rPr>
-              <w:t>2    Carlos Ruiz                     5.360.000</w:t>
-              <w:br/>
-            </w:r>
-            <w:r>
-              <w:rPr>
-                <w:rFonts w:ascii="Courier New" w:hAnsi="Courier New"/>
-                <w:sz w:val="18"/>
-              </w:rPr>
-              <w:t>3    María Gómez                     1.870.000</w:t>
-              <w:br/>
-            </w:r>
-            <w:r>
-              <w:rPr>
-                <w:rFonts w:ascii="Courier New" w:hAnsi="Courier New"/>
-                <w:sz w:val="18"/>
-              </w:rPr>
-              <w:t>4    Luis Pérez                      1.200.000</w:t>
-              <w:br/>
-            </w:r>
-            <w:r>
-              <w:rPr>
-                <w:rFonts w:ascii="Courier New" w:hAnsi="Courier New"/>
-                <w:sz w:val="18"/>
-              </w:rPr>
-              <w:br/>
-            </w:r>
-            <w:r>
-              <w:rPr>
-                <w:rFonts w:ascii="Courier New" w:hAnsi="Courier New"/>
-                <w:sz w:val="18"/>
-              </w:rPr>
-              <w:t>--- PRODUCTOS MAS VENDIDOS (por ingresos generados) ---</w:t>
-              <w:br/>
-            </w:r>
-            <w:r>
-              <w:rPr>
-                <w:rFonts w:ascii="Courier New" w:hAnsi="Courier New"/>
-                <w:sz w:val="18"/>
-              </w:rPr>
-              <w:t>#    Producto                    Unidades        Ingresos</w:t>
-              <w:br/>
-            </w:r>
-            <w:r>
-              <w:rPr>
-                <w:rFonts w:ascii="Courier New" w:hAnsi="Courier New"/>
-                <w:sz w:val="18"/>
-              </w:rPr>
-              <w:t>1    Laptop Lenovo                      2       9.000.000</w:t>
-              <w:br/>
-            </w:r>
-            <w:r>
-              <w:rPr>
-                <w:rFonts w:ascii="Courier New" w:hAnsi="Courier New"/>
-                <w:sz w:val="18"/>
-              </w:rPr>
-              <w:t>2    Monitor 24"                        2       1.900.000</w:t>
-              <w:br/>
-            </w:r>
-            <w:r>
-              <w:rPr>
-                <w:rFonts w:ascii="Courier New" w:hAnsi="Courier New"/>
-                <w:sz w:val="18"/>
-              </w:rPr>
-              <w:t>3    Impresora HP                       2       1.560.000</w:t>
-              <w:br/>
-            </w:r>
-            <w:r>
-              <w:rPr>
-                <w:rFonts w:ascii="Courier New" w:hAnsi="Courier New"/>
-                <w:sz w:val="18"/>
-              </w:rPr>
-              <w:t>4    SSD 1TB                            2         840.000</w:t>
-              <w:br/>
-            </w:r>
-            <w:r>
-              <w:rPr>
-                <w:rFonts w:ascii="Courier New" w:hAnsi="Courier New"/>
-                <w:sz w:val="18"/>
-              </w:rPr>
-              <w:t>5    Teclado Mecánico                   3         750.000</w:t>
-              <w:br/>
-            </w:r>
-            <w:r>
-              <w:rPr>
-                <w:rFonts w:ascii="Courier New" w:hAnsi="Courier New"/>
-                <w:sz w:val="18"/>
-              </w:rPr>
-              <w:br/>
-            </w:r>
-            <w:r>
-              <w:rPr>
-                <w:rFonts w:ascii="Courier New" w:hAnsi="Courier New"/>
-                <w:sz w:val="18"/>
-              </w:rPr>
-              <w:t>=================================================</w:t>
-              <w:br/>
-            </w:r>
-            <w:r>
-              <w:rPr>
-                <w:rFonts w:ascii="Courier New" w:hAnsi="Courier New"/>
-                <w:sz w:val="18"/>
-              </w:rPr>
-              <w:t xml:space="preserve">           FIN DEL REPORTE</w:t>
-              <w:br/>
-            </w:r>
-            <w:r>
-              <w:rPr>
-                <w:rFonts w:ascii="Courier New" w:hAnsi="Courier New"/>
-                <w:sz w:val="18"/>
-              </w:rPr>
-              <w:t>=================================================</w:t>
-            </w:r>
-          </w:p>
-        </w:tc>
-      </w:tr>
-    </w:tbl>
-    <w:p>
-      <w:pPr>
-        <w:spacing w:after="40"/>
-      </w:pPr>
+      <w:r>
+        <w:rPr>
+          <w:i/>
+          <w:sz w:val="20"/>
+        </w:rPr>
+        <w:t>Salida del programa: totales del periodo y rankings Top 5.</w:t>
+      </w:r>
     </w:p>
     <w:p>
       <w:pPr>
@@ -2883,116 +2637,75 @@
     <w:p>
       <w:pPr>
         <w:keepNext/>
-        <w:jc w:val="both"/>
+        <w:spacing w:after="40"/>
       </w:pPr>
       <w:r>
         <w:rPr>
-          <w:b w:val="0"/>
+          <w:b/>
           <w:i w:val="0"/>
         </w:rPr>
-        <w:t>Ante parámetros incorrectos el programa responde con un mensaje en lugar de fallar:</w:t>
+        <w:t>Manejo de parámetros incorrectos:</w:t>
       </w:r>
     </w:p>
-    <w:tbl>
-      <w:tblPr>
-        <w:tblStyle w:val="TableGrid"/>
-        <w:tblW w:type="auto" w:w="0"/>
-        <w:jc w:val="center"/>
-        <w:tblLook w:firstColumn="1" w:firstRow="1" w:lastColumn="0" w:lastRow="0" w:noHBand="0" w:noVBand="1" w:val="04A0"/>
-      </w:tblPr>
-      <w:tblGrid>
-        <w:gridCol w:w="9360"/>
-      </w:tblGrid>
-      <w:tr>
-        <w:trPr>
-          <w:cantSplit/>
-        </w:trPr>
-        <w:tc>
-          <w:tcPr>
-            <w:tcW w:type="dxa" w:w="9360"/>
-            <w:shd w:val="clear" w:color="auto" w:fill="F2F2F2"/>
-          </w:tcPr>
-          <w:p>
-            <w:pPr>
-              <w:spacing w:after="0" w:line="240" w:lineRule="auto"/>
-            </w:pPr>
-            <w:r>
-              <w:rPr>
-                <w:rFonts w:ascii="Courier New" w:hAnsi="Courier New"/>
-                <w:sz w:val="18"/>
-              </w:rPr>
-              <w:t>&gt; java Main</w:t>
-              <w:br/>
-            </w:r>
-            <w:r>
-              <w:rPr>
-                <w:rFonts w:ascii="Courier New" w:hAnsi="Courier New"/>
-                <w:sz w:val="18"/>
-              </w:rPr>
-              <w:t>Uso: java Main &lt;archivo.csv&gt; &lt;fechaInicio aaaa-mm-dd&gt; &lt;fechaFin aaaa-mm-dd&gt;</w:t>
-              <w:br/>
-            </w:r>
-            <w:r>
-              <w:rPr>
-                <w:rFonts w:ascii="Courier New" w:hAnsi="Courier New"/>
-                <w:sz w:val="18"/>
-              </w:rPr>
-              <w:t>Ejemplo: java Main ventas.csv 2026-01-01 2026-06-30</w:t>
-              <w:br/>
-            </w:r>
-            <w:r>
-              <w:rPr>
-                <w:rFonts w:ascii="Courier New" w:hAnsi="Courier New"/>
-                <w:sz w:val="18"/>
-              </w:rPr>
-              <w:br/>
-            </w:r>
-            <w:r>
-              <w:rPr>
-                <w:rFonts w:ascii="Courier New" w:hAnsi="Courier New"/>
-                <w:sz w:val="18"/>
-              </w:rPr>
-              <w:t>&gt; java Main ventas.csv 2026-06-30 2026-01-01</w:t>
-              <w:br/>
-            </w:r>
-            <w:r>
-              <w:rPr>
-                <w:rFonts w:ascii="Courier New" w:hAnsi="Courier New"/>
-                <w:sz w:val="18"/>
-              </w:rPr>
-              <w:t>Error: la fecha inicial es posterior a la fecha final</w:t>
-              <w:br/>
-            </w:r>
-            <w:r>
-              <w:rPr>
-                <w:rFonts w:ascii="Courier New" w:hAnsi="Courier New"/>
-                <w:sz w:val="18"/>
-              </w:rPr>
-              <w:br/>
-            </w:r>
-            <w:r>
-              <w:rPr>
-                <w:rFonts w:ascii="Courier New" w:hAnsi="Courier New"/>
-                <w:sz w:val="18"/>
-              </w:rPr>
-              <w:t>&gt; java Main noexiste.csv 2026-01-01 2026-06-30</w:t>
-              <w:br/>
-            </w:r>
-            <w:r>
-              <w:rPr>
-                <w:rFonts w:ascii="Courier New" w:hAnsi="Courier New"/>
-                <w:sz w:val="18"/>
-              </w:rPr>
-              <w:t>Error: no se pudo leer el archivo noexiste.csv</w:t>
-            </w:r>
-          </w:p>
-        </w:tc>
-      </w:tr>
-    </w:tbl>
     <w:p>
       <w:pPr>
+        <w:keepNext/>
         <w:spacing w:after="40"/>
+        <w:jc w:val="center"/>
       </w:pPr>
+      <w:r>
+        <w:drawing>
+          <wp:inline xmlns:a="http://schemas.openxmlformats.org/drawingml/2006/main" xmlns:pic="http://schemas.openxmlformats.org/drawingml/2006/picture">
+            <wp:extent cx="5220000" cy="2104891"/>
+            <wp:docPr id="3" name="Picture 3"/>
+            <wp:cNvGraphicFramePr>
+              <a:graphicFrameLocks noChangeAspect="1"/>
+            </wp:cNvGraphicFramePr>
+            <a:graphic>
+              <a:graphicData uri="http://schemas.openxmlformats.org/drawingml/2006/picture">
+                <pic:pic>
+                  <pic:nvPicPr>
+                    <pic:cNvPr id="0" name="consola3.png"/>
+                    <pic:cNvPicPr/>
+                  </pic:nvPicPr>
+                  <pic:blipFill>
+                    <a:blip r:embed="rId12"/>
+                    <a:stretch>
+                      <a:fillRect/>
+                    </a:stretch>
+                  </pic:blipFill>
+                  <pic:spPr>
+                    <a:xfrm>
+                      <a:off x="0" y="0"/>
+                      <a:ext cx="5220000" cy="2104891"/>
+                    </a:xfrm>
+                    <a:prstGeom prst="rect"/>
+                  </pic:spPr>
+                </pic:pic>
+              </a:graphicData>
+            </a:graphic>
+          </wp:inline>
+        </w:drawing>
+      </w:r>
+    </w:p>
+    <w:p>
+      <w:pPr>
+        <w:jc w:val="center"/>
+      </w:pPr>
+      <w:r>
+        <w:rPr>
+          <w:b/>
+          <w:sz w:val="20"/>
+        </w:rPr>
+        <w:t xml:space="preserve">Figura 3. </w:t>
+      </w:r>
+      <w:r>
+        <w:rPr>
+          <w:i/>
+          <w:sz w:val="20"/>
+        </w:rPr>
+        <w:t>Sin parámetros, fechas invertidas, archivo inexistente y fecha con formato inválido.</w:t>
+      </w:r>
     </w:p>
     <w:p>
       <w:pPr>

</xml_diff>